<commit_message>
Corregir deploy.sh: eliminar config de Apache invalida, agregar configtest, conteo de intentos y variable de reinicio de base de datos
</commit_message>
<xml_diff>
--- a/docs/INFORME-EPM.docx
+++ b/docs/INFORME-EPM.docx
@@ -177,7 +177,7 @@
           <w:i w:val="0"/>
           <w:sz w:val="22"/>
         </w:rPr>
-        <w:t>El presente informe documenta el proceso de diseño, construcción y despliegue en la nube de una aplicación web de gestión de proyectos empresariales denominada EPM (Enterprise Project Management). La solución se desarrolla con Python mediante el microframework Flask, y persiste sus datos en un servidor MySQL. El despliegue se ejecuta sobre una máquina virtual Ubuntu en infraestructura de nube pública, empleando Apache HTTP Server con el módulo mod_wsgi como servidor de aplicaciones y Gunicorn como servidor WSGI, sin hacer uso de contenedores Docker, conforme a las restricciones de la actividad. La aplicación implementa un modelo de seguridad basado en roles que distingue entre usuarios administrativos y usuarios operativos, con registro de auditoría de todas las transacciones administrativas. El proceso se automatiza mediante un script de despliegue que permite replicar el ambiente completo con un único comando, garantizando la reproducibilidad del procedimiento.</w:t>
+        <w:t>El presente informe documenta el proceso de diseño, construcción y despliegue en la nube de una aplicación web de gestión de proyectos empresariales denominada EPM (Enterprise Project Management). La solución se desarrolla con Python mediante el microframework Flask, y persiste sus datos en un servidor MySQL. El despliegue se ejecuta sobre una máquina virtual Ubuntu en infraestructura de nube pública, empleando Apache HTTP Server con el módulo mod_wsgi como servidor de aplicaciones a través de la interfaz WSGI, sin hacer uso de contenedores Docker, conforme a las restricciones de la actividad. La aplicación implementa un modelo de seguridad basado en roles que distingue entre usuarios administrativos y usuarios operativos, con registro de auditoría de todas las transacciones administrativas. El proceso se automatiza mediante un script de despliegue que permite replicar el ambiente completo con un único comando, garantizando la reproducibilidad del procedimiento.</w:t>
       </w:r>
     </w:p>
     <w:p>
@@ -872,7 +872,7 @@
           </w:tcPr>
           <w:p>
             <w:r>
-              <w:t>Gunicorn</w:t>
+              <w:t>mod_wsgi</w:t>
             </w:r>
           </w:p>
         </w:tc>
@@ -882,7 +882,7 @@
           </w:tcPr>
           <w:p>
             <w:r>
-              <w:t>Recomendado por Flask para producción.</w:t>
+              <w:t>Proceso WSGI administrado por el propio Apache.</w:t>
             </w:r>
           </w:p>
         </w:tc>
@@ -2880,7 +2880,7 @@
         <w:pStyle w:val="ListBullet"/>
       </w:pPr>
       <w:r>
-        <w:t>Idempotencia: el script puede ejecutarse varias veces sin producir efectos adversos.</w:t>
+        <w:t>Reejecución segura: si el servidor ya tiene el código, el script lo actualiza con git pull y conserva los datos de la base de datos; solo la recrea cuando se invoca con RESET_DB=1.</w:t>
       </w:r>
     </w:p>
     <w:p>
@@ -3001,7 +3001,7 @@
           <w:i w:val="0"/>
           <w:sz w:val="22"/>
         </w:rPr>
-        <w:t>El script ejecuta las siguientes ocho etapas:</w:t>
+        <w:t>El script ejecuta las siguientes ocho etapas, seguidas de la apertura del firewall y una comprobación final:</w:t>
       </w:r>
     </w:p>
     <w:p>
@@ -3027,7 +3027,7 @@
           <w:rFonts w:ascii="Consolas" w:hAnsi="Consolas"/>
           <w:sz w:val="19"/>
         </w:rPr>
-        <w:t>Paso 2/8   Instalar Apache, MySQL, Python y Git</w:t>
+        <w:t>Paso 2/8   Instalar Apache, MySQL, Python, mod_wsgi y Git</w:t>
       </w:r>
     </w:p>
     <w:p>
@@ -3040,7 +3040,7 @@
           <w:rFonts w:ascii="Consolas" w:hAnsi="Consolas"/>
           <w:sz w:val="19"/>
         </w:rPr>
-        <w:t>Paso 3/8   Descargar el código desde el repositorio</w:t>
+        <w:t>Paso 3/8   Obtener el código (git clone la primera vez, git pull después)</w:t>
       </w:r>
     </w:p>
     <w:p>
@@ -3053,7 +3053,7 @@
           <w:rFonts w:ascii="Consolas" w:hAnsi="Consolas"/>
           <w:sz w:val="19"/>
         </w:rPr>
-        <w:t>Paso 4/8   Crear entorno virtual e instalar dependencias</w:t>
+        <w:t>Paso 4/8   Crear el entorno virtual e instalar las dependencias</w:t>
       </w:r>
     </w:p>
     <w:p>
@@ -3079,7 +3079,7 @@
           <w:rFonts w:ascii="Consolas" w:hAnsi="Consolas"/>
           <w:sz w:val="19"/>
         </w:rPr>
-        <w:t>Paso 6/8   Cargar el esquema y los datos iniciales</w:t>
+        <w:t>Paso 6/8   Escribir la configuración en .env con permisos 640</w:t>
       </w:r>
     </w:p>
     <w:p>
@@ -3092,7 +3092,7 @@
           <w:rFonts w:ascii="Consolas" w:hAnsi="Consolas"/>
           <w:sz w:val="19"/>
         </w:rPr>
-        <w:t>Paso 7/8   Generar el archivo de variables de entorno</w:t>
+        <w:t>Paso 7/8   Configurar Apache con mod_wsgi</w:t>
       </w:r>
     </w:p>
     <w:p>
@@ -3105,7 +3105,33 @@
           <w:rFonts w:ascii="Consolas" w:hAnsi="Consolas"/>
           <w:sz w:val="19"/>
         </w:rPr>
-        <w:t>Paso 8/8   Configurar Apache con mod_wsgi y activar el firewall</w:t>
+        <w:t>Paso 8/8   Validar con apache2ctl configtest y reiniciar Apache</w:t>
+      </w:r>
+    </w:p>
+    <w:p>
+      <w:pPr>
+        <w:spacing w:after="0"/>
+        <w:ind w:left="454"/>
+      </w:pPr>
+      <w:r>
+        <w:rPr>
+          <w:rFonts w:ascii="Consolas" w:hAnsi="Consolas"/>
+          <w:sz w:val="19"/>
+        </w:rPr>
+        <w:t>Extra      Abrir los puertos 22 y 80 en ufw</w:t>
+      </w:r>
+    </w:p>
+    <w:p>
+      <w:pPr>
+        <w:spacing w:after="0"/>
+        <w:ind w:left="454"/>
+      </w:pPr>
+      <w:r>
+        <w:rPr>
+          <w:rFonts w:ascii="Consolas" w:hAnsi="Consolas"/>
+          <w:sz w:val="19"/>
+        </w:rPr>
+        <w:t>Extra      Verificar que /login responde HTTP 200</w:t>
       </w:r>
     </w:p>
     <w:p>
@@ -3170,6 +3196,71 @@
           <w:sz w:val="19"/>
         </w:rPr>
         <w:t>sudo systemctl restart apache2</w:t>
+      </w:r>
+    </w:p>
+    <w:p>
+      <w:pPr>
+        <w:jc w:val="both"/>
+      </w:pPr>
+      <w:r>
+        <w:rPr>
+          <w:b w:val="0"/>
+          <w:i w:val="0"/>
+          <w:sz w:val="22"/>
+        </w:rPr>
+        <w:t>El propio script puede encargarse de esta actualización, ya que detecta si el código ya existe en el servidor:</w:t>
+      </w:r>
+    </w:p>
+    <w:p>
+      <w:pPr>
+        <w:spacing w:after="0"/>
+        <w:ind w:left="454"/>
+      </w:pPr>
+      <w:r>
+        <w:rPr>
+          <w:rFonts w:ascii="Consolas" w:hAnsi="Consolas"/>
+          <w:sz w:val="19"/>
+        </w:rPr>
+        <w:t>cd /var/www/epm</w:t>
+      </w:r>
+    </w:p>
+    <w:p>
+      <w:pPr>
+        <w:spacing w:after="0"/>
+        <w:ind w:left="454"/>
+      </w:pPr>
+      <w:r>
+        <w:rPr>
+          <w:rFonts w:ascii="Consolas" w:hAnsi="Consolas"/>
+          <w:sz w:val="19"/>
+        </w:rPr>
+        <w:t>sudo bash deploy/deploy.sh</w:t>
+      </w:r>
+    </w:p>
+    <w:p>
+      <w:pPr>
+        <w:spacing w:after="0"/>
+        <w:ind w:left="454"/>
+      </w:pPr>
+      <w:r>
+        <w:rPr>
+          <w:rFonts w:ascii="Consolas" w:hAnsi="Consolas"/>
+          <w:sz w:val="19"/>
+        </w:rPr>
+        <w:t># y, solo si se quiere reiniciar la base de datos:</w:t>
+      </w:r>
+    </w:p>
+    <w:p>
+      <w:pPr>
+        <w:spacing w:after="0"/>
+        <w:ind w:left="454"/>
+      </w:pPr>
+      <w:r>
+        <w:rPr>
+          <w:rFonts w:ascii="Consolas" w:hAnsi="Consolas"/>
+          <w:sz w:val="19"/>
+        </w:rPr>
+        <w:t>RESET_DB=1 sudo bash deploy/deploy.sh</w:t>
       </w:r>
     </w:p>
     <w:p>

</xml_diff>